<commit_message>
Finalise report and tidy repo after skipping chatbot and avatar
- Remove the drafted Chatbase pack and HeyGen script, and the app's
  chatbot slot (integrations config, widget, header and How it works links)
- Architecture diagram shows the chatbot as a planned component, not built
- Report: author Kazumi Li, the author's reflection rewrites as plain text,
  no highlights, no chatbot or avatar placeholders; still 5 pages
- Reorganise deliverables: report/ (report only), process/ (prompt log,
  consistency audit, spot check, VERIFY), demo/, architecture/, plus an index
- Update README, PROGRESS, prompt log and VERIFY; rebuild /docs and screenshots

Co-Authored-By: Claude Opus 5.5 <noreply@anthropic.com>
Claude-Session: https://claude.ai/code/session_01Vo2m2TT1SrVNzdLXj61Z9h
</commit_message>
<xml_diff>
--- a/deliverables/report/Simrule-report.docx
+++ b/deliverables/report/Simrule-report.docx
@@ -28,7 +28,7 @@
           <w:sz w:val="19"/>
           <w:szCs w:val="19"/>
         </w:rPr>
-        <w:t xml:space="preserve">&lt;YOUR FULL NAME&gt;  |  AI Prototyping for Business Innovation (Ivey Online, delivered on Uplimit), Weeks 4-5 Innovation Challenge  |  October 5, 2026</w:t>
+        <w:t xml:space="preserve">Kazumi Li  |  AI Prototyping for Business Innovation (Ivey Online, delivered on Uplimit), Weeks 4-5 Innovation Challenge  |  October 7, 2026</w:t>
       </w:r>
     </w:p>
     <w:p>
@@ -45,7 +45,7 @@
         </w:rPr>
         <w:t xml:space="preserve">Live app: </w:t>
       </w:r>
-      <w:hyperlink w:history="1" r:id="rIdip9qon6fffalgngx9fho_">
+      <w:hyperlink w:history="1" r:id="rIdahxjc5q6lexctdaiulrav">
         <w:r>
           <w:rPr>
             <w:rStyle w:val="Hyperlink"/>
@@ -74,7 +74,7 @@
         </w:rPr>
         <w:t xml:space="preserve">Code: </w:t>
       </w:r>
-      <w:hyperlink w:history="1" r:id="rIder-q2_otgbi-lvqe-gxh0">
+      <w:hyperlink w:history="1" r:id="rIdig4ylb0izvyttxt40yccv">
         <w:r>
           <w:rPr>
             <w:rStyle w:val="Hyperlink"/>
@@ -88,47 +88,6 @@
     </w:p>
     <w:p>
       <w:pPr>
-        <w:spacing w:after="30" w:line="252"/>
-      </w:pPr>
-      <w:r>
-        <w:rPr>
-          <w:rFonts w:ascii="Arial" w:cs="Arial" w:eastAsia="Arial" w:hAnsi="Arial"/>
-          <w:b/>
-          <w:bCs/>
-          <w:sz w:val="19"/>
-          <w:szCs w:val="19"/>
-        </w:rPr>
-        <w:t xml:space="preserve">Regulatory Assistant chatbot: </w:t>
-      </w:r>
-      <w:r>
-        <w:rPr>
-          <w:rFonts w:ascii="Arial" w:cs="Arial" w:eastAsia="Arial" w:hAnsi="Arial"/>
-          <w:sz w:val="19"/>
-          <w:szCs w:val="19"/>
-        </w:rPr>
-        <w:t xml:space="preserve">[link added after Chatbase setup]   </w:t>
-      </w:r>
-      <w:r>
-        <w:rPr>
-          <w:rFonts w:ascii="Arial" w:cs="Arial" w:eastAsia="Arial" w:hAnsi="Arial"/>
-          <w:b/>
-          <w:bCs/>
-          <w:sz w:val="19"/>
-          <w:szCs w:val="19"/>
-        </w:rPr>
-        <w:t xml:space="preserve">Avatar video: </w:t>
-      </w:r>
-      <w:r>
-        <w:rPr>
-          <w:rFonts w:ascii="Arial" w:cs="Arial" w:eastAsia="Arial" w:hAnsi="Arial"/>
-          <w:sz w:val="19"/>
-          <w:szCs w:val="19"/>
-        </w:rPr>
-        <w:t xml:space="preserve">[link added after recording]</w:t>
-      </w:r>
-    </w:p>
-    <w:p>
-      <w:pPr>
         <w:pBdr>
           <w:bottom w:val="single" w:color="05473A" w:sz="6" w:space="4"/>
         </w:pBdr>
@@ -281,7 +240,7 @@
           <w:sz w:val="22"/>
           <w:szCs w:val="22"/>
         </w:rPr>
-        <w:t xml:space="preserve"> in which reviewers accept or override every finding, divergence triggers senior sign-off, and the reviewer must confirm ownership of the rationale. A chatbot pack, an architecture diagram and an avatar script share the same vocabulary.</w:t>
+        <w:t xml:space="preserve"> in which reviewers accept or override every finding, divergence triggers senior sign-off, and the reviewer must confirm ownership of the rationale. A one-page architecture diagram and a screen-recording script use the same vocabulary.</w:t>
       </w:r>
     </w:p>
     <w:p>
@@ -319,7 +278,7 @@
           <w:sz w:val="22"/>
           <w:szCs w:val="22"/>
         </w:rPr>
-        <w:t xml:space="preserve">Each component was built with the tool that best fitted its job:</w:t>
+        <w:t xml:space="preserve">Each component was built with the tool that best fitted its job. The optional chatbot and avatar video were not built.</w:t>
       </w:r>
     </w:p>
     <w:tbl>
@@ -688,7 +647,7 @@
                 <w:sz w:val="19"/>
                 <w:szCs w:val="19"/>
               </w:rPr>
-              <w:t xml:space="preserve">Chatbot</w:t>
+              <w:t xml:space="preserve">Architecture diagram</w:t>
             </w:r>
           </w:p>
         </w:tc>
@@ -714,7 +673,7 @@
                 <w:sz w:val="19"/>
                 <w:szCs w:val="19"/>
               </w:rPr>
-              <w:t xml:space="preserve">Chatbase: 10 source files, 28 Q&amp;A pairs</w:t>
+              <w:t xml:space="preserve">Hand-laid SVG exported to PNG and PDF</w:t>
             </w:r>
           </w:p>
         </w:tc>
@@ -740,87 +699,7 @@
                 <w:sz w:val="19"/>
                 <w:szCs w:val="19"/>
               </w:rPr>
-              <w:t xml:space="preserve">Quick to configure; shares the knowledge base and vocabulary of the app.</w:t>
-            </w:r>
-          </w:p>
-        </w:tc>
-      </w:tr>
-      <w:tr>
-        <w:tc>
-          <w:tcPr>
-            <w:tcW w:type="dxa" w:w="1900"/>
-            <w:tcMar>
-              <w:top w:type="dxa" w:w="40"/>
-              <w:left w:type="dxa" w:w="80"/>
-              <w:bottom w:type="dxa" w:w="40"/>
-              <w:right w:type="dxa" w:w="80"/>
-            </w:tcMar>
-          </w:tcPr>
-          <w:p>
-            <w:pPr>
-              <w:spacing w:after="0" w:line="240"/>
-            </w:pPr>
-            <w:r>
-              <w:rPr>
-                <w:rFonts w:ascii="Arial" w:cs="Arial" w:eastAsia="Arial" w:hAnsi="Arial"/>
-                <w:b w:val="false"/>
-                <w:bCs w:val="false"/>
-                <w:sz w:val="19"/>
-                <w:szCs w:val="19"/>
-              </w:rPr>
-              <w:t xml:space="preserve">Avatar and diagram</w:t>
-            </w:r>
-          </w:p>
-        </w:tc>
-        <w:tc>
-          <w:tcPr>
-            <w:tcW w:type="dxa" w:w="2900"/>
-            <w:tcMar>
-              <w:top w:type="dxa" w:w="40"/>
-              <w:left w:type="dxa" w:w="80"/>
-              <w:bottom w:type="dxa" w:w="40"/>
-              <w:right w:type="dxa" w:w="80"/>
-            </w:tcMar>
-          </w:tcPr>
-          <w:p>
-            <w:pPr>
-              <w:spacing w:after="0" w:line="240"/>
-            </w:pPr>
-            <w:r>
-              <w:rPr>
-                <w:rFonts w:ascii="Arial" w:cs="Arial" w:eastAsia="Arial" w:hAnsi="Arial"/>
-                <w:b w:val="false"/>
-                <w:bCs w:val="false"/>
-                <w:sz w:val="19"/>
-                <w:szCs w:val="19"/>
-              </w:rPr>
-              <w:t xml:space="preserve">HeyGen script; hand-laid SVG exported to PNG and PDF</w:t>
-            </w:r>
-          </w:p>
-        </w:tc>
-        <w:tc>
-          <w:tcPr>
-            <w:tcW w:type="dxa" w:w="4560"/>
-            <w:tcMar>
-              <w:top w:type="dxa" w:w="40"/>
-              <w:left w:type="dxa" w:w="80"/>
-              <w:bottom w:type="dxa" w:w="40"/>
-              <w:right w:type="dxa" w:w="80"/>
-            </w:tcMar>
-          </w:tcPr>
-          <w:p>
-            <w:pPr>
-              <w:spacing w:after="0" w:line="240"/>
-            </w:pPr>
-            <w:r>
-              <w:rPr>
-                <w:rFonts w:ascii="Arial" w:cs="Arial" w:eastAsia="Arial" w:hAnsi="Arial"/>
-                <w:b w:val="false"/>
-                <w:bCs w:val="false"/>
-                <w:sz w:val="19"/>
-                <w:szCs w:val="19"/>
-              </w:rPr>
-              <w:t xml:space="preserve">An executive summary under three minutes and a one-page view of where humans stay in control.</w:t>
+              <w:t xml:space="preserve">A one-page view of where humans stay in control and what production would need.</w:t>
             </w:r>
           </w:p>
         </w:tc>
@@ -891,7 +770,7 @@
           <w:sz w:val="22"/>
           <w:szCs w:val="22"/>
         </w:rPr>
-        <w:t xml:space="preserve">The brief's 21 codes plus four I added (prohibited factor, less restrictive alternative, subjective judgment, privacy intrusion) gave findings one vocabulary that the dashboard, consistency monitor and chatbot reuse.</w:t>
+        <w:t xml:space="preserve">The brief's 21 codes plus four I added (prohibited factor, less restrictive alternative, subjective judgment, privacy intrusion) gave findings one vocabulary that the dashboard, consistency monitor and decision records reuse.</w:t>
       </w:r>
     </w:p>
     <w:p>
@@ -1358,7 +1237,6 @@
           <w:rFonts w:ascii="Arial" w:cs="Arial" w:eastAsia="Arial" w:hAnsi="Arial"/>
           <w:sz w:val="22"/>
           <w:szCs w:val="22"/>
-          <w:highlight w:val="yellow"/>
         </w:rPr>
         <w:t xml:space="preserve">Building Simrule changed what I think AI is for in a regulated industry: its main value is not deciding faster, but making each judgment explicit enough for a person to check. </w:t>
       </w:r>
@@ -1375,9 +1253,8 @@
           <w:rFonts w:ascii="Arial" w:cs="Arial" w:eastAsia="Arial" w:hAnsi="Arial"/>
           <w:sz w:val="22"/>
           <w:szCs w:val="22"/>
-          <w:highlight w:val="yellow"/>
-        </w:rPr>
-        <w:t xml:space="preserve">For a regulator, a correct answer that cannot be explained is close to worthless, so I now see transparency as the product rather than a feature. </w:t>
+        </w:rPr>
+        <w:t xml:space="preserve">For a regulator, a correct answer that cannot be explained has no value, so I now see transparency as the product rather than an add-on feature. </w:t>
       </w:r>
       <w:r>
         <w:rPr>
@@ -1405,7 +1282,6 @@
           <w:rFonts w:ascii="Arial" w:cs="Arial" w:eastAsia="Arial" w:hAnsi="Arial"/>
           <w:sz w:val="22"/>
           <w:szCs w:val="22"/>
-          <w:highlight w:val="yellow"/>
         </w:rPr>
         <w:t xml:space="preserve">I want to work in quantitative or AI roles in Japan, where I expect model governance to be at least as demanding as in this project. </w:t>
       </w:r>
@@ -1414,16 +1290,14 @@
           <w:rFonts w:ascii="Arial" w:cs="Arial" w:eastAsia="Arial" w:hAnsi="Arial"/>
           <w:sz w:val="22"/>
           <w:szCs w:val="22"/>
-          <w:highlight w:val="yellow"/>
-        </w:rPr>
-        <w:t xml:space="preserve">I plan to carry three habits from Simrule into that work: write the schema before the prompt, keep model judgment separate from the rule that acts on it, and test a model’s explanations as rigorously as its accuracy. </w:t>
-      </w:r>
-      <w:r>
-        <w:rPr>
-          <w:rFonts w:ascii="Arial" w:cs="Arial" w:eastAsia="Arial" w:hAnsi="Arial"/>
-          <w:sz w:val="22"/>
-          <w:szCs w:val="22"/>
-          <w:highlight w:val="yellow"/>
+        </w:rPr>
+        <w:t xml:space="preserve">I plan to carry three habits from Simrule into that work: write the schema cautiously before the prompt, keep model judgment separate from the rule that acts on it, and test a model’s explanations as rigorously as its accuracy. </w:t>
+      </w:r>
+      <w:r>
+        <w:rPr>
+          <w:rFonts w:ascii="Arial" w:cs="Arial" w:eastAsia="Arial" w:hAnsi="Arial"/>
+          <w:sz w:val="22"/>
+          <w:szCs w:val="22"/>
         </w:rPr>
         <w:t xml:space="preserve">In trading research I would apply the same split, letting a model propose signals with evidence while transparent, versioned code decides how they are used, so a risk committee can audit both. </w:t>
       </w:r>
@@ -1432,9 +1306,8 @@
           <w:rFonts w:ascii="Arial" w:cs="Arial" w:eastAsia="Arial" w:hAnsi="Arial"/>
           <w:sz w:val="22"/>
           <w:szCs w:val="22"/>
-          <w:highlight w:val="yellow"/>
-        </w:rPr>
-        <w:t xml:space="preserve">I also want to design the audit trail first rather than last, because it is the feature that makes everything else trustworthy.</w:t>
+        </w:rPr>
+        <w:t xml:space="preserve">I also want to design the audit trail first rather than last, since the accuracy and integrity is the most crucial element of all, and it is the feature that makes everything else trustworthy.</w:t>
       </w:r>
     </w:p>
     <w:p>
@@ -1446,9 +1319,8 @@
           <w:rFonts w:ascii="Arial" w:cs="Arial" w:eastAsia="Arial" w:hAnsi="Arial"/>
           <w:sz w:val="22"/>
           <w:szCs w:val="22"/>
-          <w:highlight w:val="yellow"/>
-        </w:rPr>
-        <w:t xml:space="preserve">What surprised me most was how often the checks I trusted were too weak. </w:t>
+        </w:rPr>
+        <w:t xml:space="preserve">What surprised me most was how often the checks I trusted were too weak to hold AI reach at bay. </w:t>
       </w:r>
       <w:r>
         <w:rPr>
@@ -1463,7 +1335,6 @@
           <w:rFonts w:ascii="Arial" w:cs="Arial" w:eastAsia="Arial" w:hAnsi="Arial"/>
           <w:sz w:val="22"/>
           <w:szCs w:val="22"/>
-          <w:highlight w:val="yellow"/>
         </w:rPr>
         <w:t xml:space="preserve">I was also surprised that the hardest problems were not technical: deciding how severe a missing actuarial study should be, or when a postal code becomes a proxy, needed judgment I could only write down after seeing many cases. </w:t>
       </w:r>
@@ -1480,9 +1351,8 @@
           <w:rFonts w:ascii="Arial" w:cs="Arial" w:eastAsia="Arial" w:hAnsi="Arial"/>
           <w:sz w:val="22"/>
           <w:szCs w:val="22"/>
-          <w:highlight w:val="yellow"/>
-        </w:rPr>
-        <w:t xml:space="preserve">The lesson I take away is that trust in AI is earned by making disagreement easy: a reviewer must see the evidence, be able to override it with a reason, and know that someone else will check.</w:t>
+        </w:rPr>
+        <w:t xml:space="preserve">The lesson I take away is that trust in AI is earned by making disagreement easy: a reviewer must read the output line by line, or at least block by block, see the evidence, be able to override it with a reason, while knowing that someone else will check.</w:t>
       </w:r>
     </w:p>
     <w:p>
@@ -1589,14 +1459,13 @@
           <w:sz w:val="22"/>
           <w:szCs w:val="22"/>
         </w:rPr>
-        <w:t xml:space="preserve">Claude Code (Anthropic) was the engineering and analysis partner for this assignment. Working from my written brief, it wrote the application code and tests, generated the 100 structured assessments with a versioned prompt (the deterministic scoring code, not the model, produces each recommendation), produced the chatbot sources, avatar script and diagram, and drafted this report from the project logs (PROGRESS.md and prompt-log.md). Every number in the report comes from those logs. Legal references were not verified against official sources and are listed for checking in VERIFY.md. </w:t>
-      </w:r>
-      <w:r>
-        <w:rPr>
-          <w:rFonts w:ascii="Arial" w:cs="Arial" w:eastAsia="Arial" w:hAnsi="Arial"/>
-          <w:sz w:val="22"/>
-          <w:szCs w:val="22"/>
-          <w:highlight w:val="yellow"/>
+        <w:t xml:space="preserve">Claude Code (Anthropic) was the engineering and analysis partner for this assignment. Working from my written brief, it wrote the application code and tests, generated the 100 structured assessments with a versioned prompt (the deterministic scoring code, not the model, produces each recommendation), produced the architecture diagram and screen-recording script, and drafted this report from the project logs (PROGRESS.md and prompt-log.md). Every number in the report comes from those logs. Legal references were not verified against official sources and are listed for checking in VERIFY.md. </w:t>
+      </w:r>
+      <w:r>
+        <w:rPr>
+          <w:rFonts w:ascii="Arial" w:cs="Arial" w:eastAsia="Arial" w:hAnsi="Arial"/>
+          <w:sz w:val="22"/>
+          <w:szCs w:val="22"/>
         </w:rPr>
         <w:t xml:space="preserve">I reviewed the outputs, made the final design decisions, and rewrote the personal reflection in my own words.</w:t>
       </w:r>

</xml_diff>

<commit_message>
Restructure report to submission rules and tighten tone
- Executive Summary (about half a page) then a page break; Methodology,
  Limitations and Risks, and Personal Reflection each on their own page;
  appendix on page 5 (5 pages total)
- Generator fails if any section does not start on its expected page
- Technical, concise rewrite of all sections; two risks added (correlated
  errors in evaluation, shallow text matching)
- Reflection keeps the author's sentences, with light grammar edits to three

Co-Authored-By: Claude Opus 5.5 <noreply@anthropic.com>
Claude-Session: https://claude.ai/code/session_01Vo2m2TT1SrVNzdLXj61Z9h
</commit_message>
<xml_diff>
--- a/deliverables/report/Simrule-report.docx
+++ b/deliverables/report/Simrule-report.docx
@@ -28,7 +28,7 @@
           <w:sz w:val="19"/>
           <w:szCs w:val="19"/>
         </w:rPr>
-        <w:t xml:space="preserve">Kazumi Li  |  AI Prototyping for Business Innovation (Ivey Online, delivered on Uplimit), Weeks 4-5 Innovation Challenge  |  October 7, 2026</w:t>
+        <w:t xml:space="preserve">Kazumi Li  |  AI Prototyping for Business Innovation (Ivey Online, delivered on Uplimit), Weeks 4-5 Innovation Challenge  |  October 15, 2026</w:t>
       </w:r>
     </w:p>
     <w:p>
@@ -45,7 +45,7 @@
         </w:rPr>
         <w:t xml:space="preserve">Live app: </w:t>
       </w:r>
-      <w:hyperlink w:history="1" r:id="rIdahxjc5q6lexctdaiulrav">
+      <w:hyperlink w:history="1" r:id="rIdpyyw4s3jktiazpcvbelsa">
         <w:r>
           <w:rPr>
             <w:rStyle w:val="Hyperlink"/>
@@ -74,7 +74,7 @@
         </w:rPr>
         <w:t xml:space="preserve">Code: </w:t>
       </w:r>
-      <w:hyperlink w:history="1" r:id="rIdig4ylb0izvyttxt40yccv">
+      <w:hyperlink w:history="1" r:id="rIdurdbdzwqdsoo9gb0lze3b">
         <w:r>
           <w:rPr>
             <w:rStyle w:val="Hyperlink"/>
@@ -127,7 +127,7 @@
           <w:sz w:val="22"/>
           <w:szCs w:val="22"/>
         </w:rPr>
-        <w:t xml:space="preserve">Ontario's Take All Comers regime lets an auto insurer decline a consumer only on grounds the regulator has approved, so each proposed decline rule decides who can buy a product the law makes compulsory. Reviewing these filings is document-heavy and judgment-heavy, and similar rules from different insurers can receive different answers. The challenge was to show how AI could make that review faster and more consistent while strengthening transparency, fair consumer outcomes and human accountability.</w:t>
+        <w:t xml:space="preserve">Under Ontario's Take All Comers rule, an auto insurer may decline a consumer only on grounds the regulator has approved. Each proposed decline rule therefore controls access to insurance that drivers are legally required to hold. Review is document-heavy and judgment-heavy, and similar rules from different insurers can receive different outcomes.</w:t>
       </w:r>
     </w:p>
     <w:p>
@@ -150,97 +150,7 @@
           <w:sz w:val="22"/>
           <w:szCs w:val="22"/>
         </w:rPr>
-        <w:t xml:space="preserve"> is a working prototype of that review workbench, live as a static web app. Five connected parts cover the brief: a </w:t>
-      </w:r>
-      <w:r>
-        <w:rPr>
-          <w:rFonts w:ascii="Arial" w:cs="Arial" w:eastAsia="Arial" w:hAnsi="Arial"/>
-          <w:b/>
-          <w:bCs/>
-          <w:sz w:val="22"/>
-          <w:szCs w:val="22"/>
-        </w:rPr>
-        <w:t xml:space="preserve">document upload interface</w:t>
-      </w:r>
-      <w:r>
-        <w:rPr>
-          <w:rFonts w:ascii="Arial" w:cs="Arial" w:eastAsia="Arial" w:hAnsi="Arial"/>
-          <w:sz w:val="22"/>
-          <w:szCs w:val="22"/>
-        </w:rPr>
-        <w:t xml:space="preserve"> that extracts rules from PDF, Word or text filings and asks the reviewer to confirm them; a </w:t>
-      </w:r>
-      <w:r>
-        <w:rPr>
-          <w:rFonts w:ascii="Arial" w:cs="Arial" w:eastAsia="Arial" w:hAnsi="Arial"/>
-          <w:b/>
-          <w:bCs/>
-          <w:sz w:val="22"/>
-          <w:szCs w:val="22"/>
-        </w:rPr>
-        <w:t xml:space="preserve">compliance dashboard</w:t>
-      </w:r>
-      <w:r>
-        <w:rPr>
-          <w:rFonts w:ascii="Arial" w:cs="Arial" w:eastAsia="Arial" w:hAnsi="Arial"/>
-          <w:sz w:val="22"/>
-          <w:szCs w:val="22"/>
-        </w:rPr>
-        <w:t xml:space="preserve"> for a queue of 100 fictional submissions; a </w:t>
-      </w:r>
-      <w:r>
-        <w:rPr>
-          <w:rFonts w:ascii="Arial" w:cs="Arial" w:eastAsia="Arial" w:hAnsi="Arial"/>
-          <w:b/>
-          <w:bCs/>
-          <w:sz w:val="22"/>
-          <w:szCs w:val="22"/>
-        </w:rPr>
-        <w:t xml:space="preserve">flagging system</w:t>
-      </w:r>
-      <w:r>
-        <w:rPr>
-          <w:rFonts w:ascii="Arial" w:cs="Arial" w:eastAsia="Arial" w:hAnsi="Arial"/>
-          <w:sz w:val="22"/>
-          <w:szCs w:val="22"/>
-        </w:rPr>
-        <w:t xml:space="preserve"> that records findings against 15 criteria in the framework's four Levels, each with issue codes, verbatim evidence and citations; a </w:t>
-      </w:r>
-      <w:r>
-        <w:rPr>
-          <w:rFonts w:ascii="Arial" w:cs="Arial" w:eastAsia="Arial" w:hAnsi="Arial"/>
-          <w:b/>
-          <w:bCs/>
-          <w:sz w:val="22"/>
-          <w:szCs w:val="22"/>
-        </w:rPr>
-        <w:t xml:space="preserve">recommendation panel</w:t>
-      </w:r>
-      <w:r>
-        <w:rPr>
-          <w:rFonts w:ascii="Arial" w:cs="Arial" w:eastAsia="Arial" w:hAnsi="Arial"/>
-          <w:sz w:val="22"/>
-          <w:szCs w:val="22"/>
-        </w:rPr>
-        <w:t xml:space="preserve"> with similar rules, a consumer lens and next steps; and a </w:t>
-      </w:r>
-      <w:r>
-        <w:rPr>
-          <w:rFonts w:ascii="Arial" w:cs="Arial" w:eastAsia="Arial" w:hAnsi="Arial"/>
-          <w:b/>
-          <w:bCs/>
-          <w:sz w:val="22"/>
-          <w:szCs w:val="22"/>
-        </w:rPr>
-        <w:t xml:space="preserve">decision workflow</w:t>
-      </w:r>
-      <w:r>
-        <w:rPr>
-          <w:rFonts w:ascii="Arial" w:cs="Arial" w:eastAsia="Arial" w:hAnsi="Arial"/>
-          <w:sz w:val="22"/>
-          <w:szCs w:val="22"/>
-        </w:rPr>
-        <w:t xml:space="preserve"> in which reviewers accept or override every finding, divergence triggers senior sign-off, and the reviewer must confirm ownership of the rationale. A one-page architecture diagram and a screen-recording script use the same vocabulary.</w:t>
+        <w:t xml:space="preserve"> is a working prototype of an AI-assisted review workbench, deployed as a static web app. It covers the path from submission to decision: document upload with reviewer-confirmed extraction; a compliance dashboard over 100 fictional submissions; a flagging system that assesses each rule against 15 criteria in the framework’s four Levels, with issue codes, verbatim evidence and citations; a recommendation panel with similar rules, consumer impact and next steps; and a decision workflow with per-finding validation, override reasons, senior sign-off and an audit trail.</w:t>
       </w:r>
     </w:p>
     <w:p>
@@ -253,12 +163,26 @@
           <w:sz w:val="22"/>
           <w:szCs w:val="22"/>
         </w:rPr>
-        <w:t xml:space="preserve">The central design choice is that the AI never writes the recommendation. It produces structured findings; fixed, published scoring code turns them into an advisory recommendation; a person decides. All 100 test rules have a recommendation (21 approve with conditions, 22 request more information, 57 recommend decline), reasoning against every criterion, explained similar rules and next steps. The potential impact is a review that starts from structured evidence rather than a blank page, applies one standard to every filing and leaves a complete audit trail, while every outcome remains a human decision.</w:t>
+        <w:t xml:space="preserve">The central design decision is that the language model never sets the recommendation. It produces structured findings; a deterministic scoring function converts them into an advisory recommendation; a reviewer makes and owns the decision. Across the 100 test rules this gives 21 approve with conditions, 22 request more information and 57 recommend decline, each with reasoning on every criterion and explained precedents.</w:t>
+      </w:r>
+    </w:p>
+    <w:p>
+      <w:pPr>
+        <w:spacing w:after="100" w:line="252"/>
+      </w:pPr>
+      <w:r>
+        <w:rPr>
+          <w:rFonts w:ascii="Arial" w:cs="Arial" w:eastAsia="Arial" w:hAnsi="Arial"/>
+          <w:sz w:val="22"/>
+          <w:szCs w:val="22"/>
+        </w:rPr>
+        <w:t xml:space="preserve">The expected impact is a faster first pass that starts from structured evidence, one standard applied across insurers, and a complete record of who decided what and why. The prototype does not replace legal or policy judgment, and its legal citations are not yet verified.</w:t>
       </w:r>
     </w:p>
     <w:p>
       <w:pPr>
         <w:pStyle w:val="Heading1"/>
+        <w:pageBreakBefore/>
         <w:spacing w:after="80" w:before="160"/>
       </w:pPr>
       <w:r>
@@ -270,15 +194,15 @@
     </w:p>
     <w:p>
       <w:pPr>
-        <w:spacing w:after="60" w:line="252"/>
-      </w:pPr>
-      <w:r>
-        <w:rPr>
-          <w:rFonts w:ascii="Arial" w:cs="Arial" w:eastAsia="Arial" w:hAnsi="Arial"/>
-          <w:sz w:val="22"/>
-          <w:szCs w:val="22"/>
-        </w:rPr>
-        <w:t xml:space="preserve">Each component was built with the tool that best fitted its job. The optional chatbot and avatar video were not built.</w:t>
+        <w:spacing w:after="80" w:line="252"/>
+      </w:pPr>
+      <w:r>
+        <w:rPr>
+          <w:rFonts w:ascii="Arial" w:cs="Arial" w:eastAsia="Arial" w:hAnsi="Arial"/>
+          <w:sz w:val="22"/>
+          <w:szCs w:val="22"/>
+        </w:rPr>
+        <w:t xml:space="preserve">I used Claude Code as the build environment instead of Bolt, Lovable or Replit, because the project needed a data pipeline, automated tests and version control alongside the interface. The optional chatbot and avatar video were not built.</w:t>
       </w:r>
     </w:p>
     <w:tbl>
@@ -294,9 +218,9 @@
         </w:tblBorders>
       </w:tblPr>
       <w:tblGrid>
-        <w:gridCol w:w="1900"/>
-        <w:gridCol w:w="2900"/>
-        <w:gridCol w:w="4560"/>
+        <w:gridCol w:w="1800"/>
+        <w:gridCol w:w="3900"/>
+        <w:gridCol w:w="3660"/>
       </w:tblGrid>
       <w:tr>
         <w:trPr>
@@ -304,7 +228,7 @@
         </w:trPr>
         <w:tc>
           <w:tcPr>
-            <w:tcW w:type="dxa" w:w="1900"/>
+            <w:tcW w:type="dxa" w:w="1800"/>
             <w:shd w:fill="E7F2ED" w:color="auto" w:val="clear"/>
             <w:tcMar>
               <w:top w:type="dxa" w:w="40"/>
@@ -331,7 +255,7 @@
         </w:tc>
         <w:tc>
           <w:tcPr>
-            <w:tcW w:type="dxa" w:w="2900"/>
+            <w:tcW w:type="dxa" w:w="3900"/>
             <w:shd w:fill="E7F2ED" w:color="auto" w:val="clear"/>
             <w:tcMar>
               <w:top w:type="dxa" w:w="40"/>
@@ -352,13 +276,13 @@
                 <w:sz w:val="19"/>
                 <w:szCs w:val="19"/>
               </w:rPr>
-              <w:t xml:space="preserve">Tool</w:t>
+              <w:t xml:space="preserve">Approach</w:t>
             </w:r>
           </w:p>
         </w:tc>
         <w:tc>
           <w:tcPr>
-            <w:tcW w:type="dxa" w:w="4560"/>
+            <w:tcW w:type="dxa" w:w="3660"/>
             <w:shd w:fill="E7F2ED" w:color="auto" w:val="clear"/>
             <w:tcMar>
               <w:top w:type="dxa" w:w="40"/>
@@ -379,7 +303,7 @@
                 <w:sz w:val="19"/>
                 <w:szCs w:val="19"/>
               </w:rPr>
-              <w:t xml:space="preserve">Why</w:t>
+              <w:t xml:space="preserve">Rationale</w:t>
             </w:r>
           </w:p>
         </w:tc>
@@ -387,7 +311,7 @@
       <w:tr>
         <w:tc>
           <w:tcPr>
-            <w:tcW w:type="dxa" w:w="1900"/>
+            <w:tcW w:type="dxa" w:w="1800"/>
             <w:tcMar>
               <w:top w:type="dxa" w:w="40"/>
               <w:left w:type="dxa" w:w="80"/>
@@ -407,13 +331,13 @@
                 <w:sz w:val="19"/>
                 <w:szCs w:val="19"/>
               </w:rPr>
-              <w:t xml:space="preserve">Web app (all five features)</w:t>
+              <w:t xml:space="preserve">Web app</w:t>
             </w:r>
           </w:p>
         </w:tc>
         <w:tc>
           <w:tcPr>
-            <w:tcW w:type="dxa" w:w="2900"/>
+            <w:tcW w:type="dxa" w:w="3900"/>
             <w:tcMar>
               <w:top w:type="dxa" w:w="40"/>
               <w:left w:type="dxa" w:w="80"/>
@@ -433,13 +357,13 @@
                 <w:sz w:val="19"/>
                 <w:szCs w:val="19"/>
               </w:rPr>
-              <w:t xml:space="preserve">Claude Code building React, TypeScript and Vite; GitHub Pages</w:t>
+              <w:t xml:space="preserve">React, TypeScript and Vite; static build on GitHub Pages</w:t>
             </w:r>
           </w:p>
         </w:tc>
         <w:tc>
           <w:tcPr>
-            <w:tcW w:type="dxa" w:w="4560"/>
+            <w:tcW w:type="dxa" w:w="3660"/>
             <w:tcMar>
               <w:top w:type="dxa" w:w="40"/>
               <w:left w:type="dxa" w:w="80"/>
@@ -459,7 +383,7 @@
                 <w:sz w:val="19"/>
                 <w:szCs w:val="19"/>
               </w:rPr>
-              <w:t xml:space="preserve">Used instead of Bolt, Lovable or Replit because the project needed a data pipeline, tests and version control in one repository, not only screens. No backend; state stays in the browser.</w:t>
+              <w:t xml:space="preserve">No backend; state stays in the browser.</w:t>
             </w:r>
           </w:p>
         </w:tc>
@@ -467,7 +391,7 @@
       <w:tr>
         <w:tc>
           <w:tcPr>
-            <w:tcW w:type="dxa" w:w="1900"/>
+            <w:tcW w:type="dxa" w:w="1800"/>
             <w:tcMar>
               <w:top w:type="dxa" w:w="40"/>
               <w:left w:type="dxa" w:w="80"/>
@@ -493,7 +417,7 @@
         </w:tc>
         <w:tc>
           <w:tcPr>
-            <w:tcW w:type="dxa" w:w="2900"/>
+            <w:tcW w:type="dxa" w:w="3900"/>
             <w:tcMar>
               <w:top w:type="dxa" w:w="40"/>
               <w:left w:type="dxa" w:w="80"/>
@@ -513,13 +437,13 @@
                 <w:sz w:val="19"/>
                 <w:szCs w:val="19"/>
               </w:rPr>
-              <w:t xml:space="preserve">Claude as a batch assessment analyst, versioned prompt, schema validator</w:t>
+              <w:t xml:space="preserve">Claude as a batch analyst under a versioned prompt; schema and content validation</w:t>
             </w:r>
           </w:p>
         </w:tc>
         <w:tc>
           <w:tcPr>
-            <w:tcW w:type="dxa" w:w="4560"/>
+            <w:tcW w:type="dxa" w:w="3660"/>
             <w:tcMar>
               <w:top w:type="dxa" w:w="40"/>
               <w:left w:type="dxa" w:w="80"/>
@@ -539,7 +463,7 @@
                 <w:sz w:val="19"/>
                 <w:szCs w:val="19"/>
               </w:rPr>
-              <w:t xml:space="preserve">Precomputing gives every rule a full, reviewable assessment and lets the same checks run on all of them.</w:t>
+              <w:t xml:space="preserve">Every rule gets a complete assessment that can be checked.</w:t>
             </w:r>
           </w:p>
         </w:tc>
@@ -547,7 +471,87 @@
       <w:tr>
         <w:tc>
           <w:tcPr>
-            <w:tcW w:type="dxa" w:w="1900"/>
+            <w:tcW w:type="dxa" w:w="1800"/>
+            <w:tcMar>
+              <w:top w:type="dxa" w:w="40"/>
+              <w:left w:type="dxa" w:w="80"/>
+              <w:bottom w:type="dxa" w:w="40"/>
+              <w:right w:type="dxa" w:w="80"/>
+            </w:tcMar>
+          </w:tcPr>
+          <w:p>
+            <w:pPr>
+              <w:spacing w:after="0" w:line="240"/>
+            </w:pPr>
+            <w:r>
+              <w:rPr>
+                <w:rFonts w:ascii="Arial" w:cs="Arial" w:eastAsia="Arial" w:hAnsi="Arial"/>
+                <w:b w:val="false"/>
+                <w:bCs w:val="false"/>
+                <w:sz w:val="19"/>
+                <w:szCs w:val="19"/>
+              </w:rPr>
+              <w:t xml:space="preserve">Recommendation</w:t>
+            </w:r>
+          </w:p>
+        </w:tc>
+        <w:tc>
+          <w:tcPr>
+            <w:tcW w:type="dxa" w:w="3900"/>
+            <w:tcMar>
+              <w:top w:type="dxa" w:w="40"/>
+              <w:left w:type="dxa" w:w="80"/>
+              <w:bottom w:type="dxa" w:w="40"/>
+              <w:right w:type="dxa" w:w="80"/>
+            </w:tcMar>
+          </w:tcPr>
+          <w:p>
+            <w:pPr>
+              <w:spacing w:after="0" w:line="240"/>
+            </w:pPr>
+            <w:r>
+              <w:rPr>
+                <w:rFonts w:ascii="Arial" w:cs="Arial" w:eastAsia="Arial" w:hAnsi="Arial"/>
+                <w:b w:val="false"/>
+                <w:bCs w:val="false"/>
+                <w:sz w:val="19"/>
+                <w:szCs w:val="19"/>
+              </w:rPr>
+              <w:t xml:space="preserve">Deterministic scoring function over the findings</w:t>
+            </w:r>
+          </w:p>
+        </w:tc>
+        <w:tc>
+          <w:tcPr>
+            <w:tcW w:type="dxa" w:w="3660"/>
+            <w:tcMar>
+              <w:top w:type="dxa" w:w="40"/>
+              <w:left w:type="dxa" w:w="80"/>
+              <w:bottom w:type="dxa" w:w="40"/>
+              <w:right w:type="dxa" w:w="80"/>
+            </w:tcMar>
+          </w:tcPr>
+          <w:p>
+            <w:pPr>
+              <w:spacing w:after="0" w:line="240"/>
+            </w:pPr>
+            <w:r>
+              <w:rPr>
+                <w:rFonts w:ascii="Arial" w:cs="Arial" w:eastAsia="Arial" w:hAnsi="Arial"/>
+                <w:b w:val="false"/>
+                <w:bCs w:val="false"/>
+                <w:sz w:val="19"/>
+                <w:szCs w:val="19"/>
+              </w:rPr>
+              <w:t xml:space="preserve">Identical findings give identical results.</w:t>
+            </w:r>
+          </w:p>
+        </w:tc>
+      </w:tr>
+      <w:tr>
+        <w:tc>
+          <w:tcPr>
+            <w:tcW w:type="dxa" w:w="1800"/>
             <w:tcMar>
               <w:top w:type="dxa" w:w="40"/>
               <w:left w:type="dxa" w:w="80"/>
@@ -573,7 +577,7 @@
         </w:tc>
         <w:tc>
           <w:tcPr>
-            <w:tcW w:type="dxa" w:w="2900"/>
+            <w:tcW w:type="dxa" w:w="3900"/>
             <w:tcMar>
               <w:top w:type="dxa" w:w="40"/>
               <w:left w:type="dxa" w:w="80"/>
@@ -593,13 +597,13 @@
                 <w:sz w:val="19"/>
                 <w:szCs w:val="19"/>
               </w:rPr>
-              <w:t xml:space="preserve">TF-IDF plus structured feature overlap</w:t>
+              <w:t xml:space="preserve">TF-IDF cosine blended with structured feature overlap</w:t>
             </w:r>
           </w:p>
         </w:tc>
         <w:tc>
           <w:tcPr>
-            <w:tcW w:type="dxa" w:w="4560"/>
+            <w:tcW w:type="dxa" w:w="3660"/>
             <w:tcMar>
               <w:top w:type="dxa" w:w="40"/>
               <w:left w:type="dxa" w:w="80"/>
@@ -619,7 +623,7 @@
                 <w:sz w:val="19"/>
                 <w:szCs w:val="19"/>
               </w:rPr>
-              <w:t xml:space="preserve">Transparent and fast in a browser; embeddings are the production path.</w:t>
+              <w:t xml:space="preserve">Transparent and runs client-side; embeddings in production.</w:t>
             </w:r>
           </w:p>
         </w:tc>
@@ -627,7 +631,7 @@
       <w:tr>
         <w:tc>
           <w:tcPr>
-            <w:tcW w:type="dxa" w:w="1900"/>
+            <w:tcW w:type="dxa" w:w="1800"/>
             <w:tcMar>
               <w:top w:type="dxa" w:w="40"/>
               <w:left w:type="dxa" w:w="80"/>
@@ -647,13 +651,13 @@
                 <w:sz w:val="19"/>
                 <w:szCs w:val="19"/>
               </w:rPr>
-              <w:t xml:space="preserve">Architecture diagram</w:t>
+              <w:t xml:space="preserve">Architecture</w:t>
             </w:r>
           </w:p>
         </w:tc>
         <w:tc>
           <w:tcPr>
-            <w:tcW w:type="dxa" w:w="2900"/>
+            <w:tcW w:type="dxa" w:w="3900"/>
             <w:tcMar>
               <w:top w:type="dxa" w:w="40"/>
               <w:left w:type="dxa" w:w="80"/>
@@ -679,7 +683,7 @@
         </w:tc>
         <w:tc>
           <w:tcPr>
-            <w:tcW w:type="dxa" w:w="4560"/>
+            <w:tcW w:type="dxa" w:w="3660"/>
             <w:tcMar>
               <w:top w:type="dxa" w:w="40"/>
               <w:left w:type="dxa" w:w="80"/>
@@ -699,7 +703,7 @@
                 <w:sz w:val="19"/>
                 <w:szCs w:val="19"/>
               </w:rPr>
-              <w:t xml:space="preserve">A one-page view of where humans stay in control and what production would need.</w:t>
+              <w:t xml:space="preserve">One page showing human controls and the production path.</w:t>
             </w:r>
           </w:p>
         </w:tc>
@@ -714,7 +718,7 @@
         <w:rPr>
           <w:rFonts w:ascii="Arial" w:cs="Arial" w:eastAsia="Arial" w:hAnsi="Arial"/>
         </w:rPr>
-        <w:t xml:space="preserve">What worked best</w:t>
+        <w:t xml:space="preserve">Approaches that worked</w:t>
       </w:r>
     </w:p>
     <w:p>
@@ -742,7 +746,7 @@
           <w:sz w:val="22"/>
           <w:szCs w:val="22"/>
         </w:rPr>
-        <w:t xml:space="preserve">Every assessment had to pass a schema and content validator: all 15 criteria, 2 to 4 sentences of reasoning, a question for the insurer and two next steps. The validator, not my impression, decided when the prompt was good enough.</w:t>
+        <w:t xml:space="preserve">A schema plus content rules (all 15 criteria, 2 to 4 sentences of reasoning, at least one question for the insurer and two next steps). The validator, not inspection, decided when the prompt was ready.</w:t>
       </w:r>
     </w:p>
     <w:p>
@@ -762,15 +766,15 @@
           <w:sz w:val="22"/>
           <w:szCs w:val="22"/>
         </w:rPr>
-        <w:t xml:space="preserve">An issue-code taxonomy. </w:t>
-      </w:r>
-      <w:r>
-        <w:rPr>
-          <w:rFonts w:ascii="Arial" w:cs="Arial" w:eastAsia="Arial" w:hAnsi="Arial"/>
-          <w:sz w:val="22"/>
-          <w:szCs w:val="22"/>
-        </w:rPr>
-        <w:t xml:space="preserve">The brief's 21 codes plus four I added (prohibited factor, less restrictive alternative, subjective judgment, privacy intrusion) gave findings one vocabulary that the dashboard, consistency monitor and decision records reuse.</w:t>
+        <w:t xml:space="preserve">A fixed issue-code taxonomy. </w:t>
+      </w:r>
+      <w:r>
+        <w:rPr>
+          <w:rFonts w:ascii="Arial" w:cs="Arial" w:eastAsia="Arial" w:hAnsi="Arial"/>
+          <w:sz w:val="22"/>
+          <w:szCs w:val="22"/>
+        </w:rPr>
+        <w:t xml:space="preserve">25 codes (21 from the brief, 4 added) shared by the dashboard, consistency monitor and decision records.</w:t>
       </w:r>
     </w:p>
     <w:p>
@@ -798,7 +802,7 @@
           <w:sz w:val="22"/>
           <w:szCs w:val="22"/>
         </w:rPr>
-        <w:t xml:space="preserve">Level 1 is a gate; Levels 2 to 4 are weighted 40, 35 and 25; thresholds are 75 and 50. All 15 weight and threshold variants matched the 13 anchor rules, so the starting values were frozen rather than tuned.</w:t>
+        <w:t xml:space="preserve">Level 1 is a gate; Levels 2 to 4 are weighted 40, 35 and 25; thresholds are 75 and 50. All 15 weight and threshold variants tested matched the 13 anchor rules, so the starting values were frozen.</w:t>
       </w:r>
     </w:p>
     <w:p>
@@ -818,15 +822,15 @@
           <w:sz w:val="22"/>
           <w:szCs w:val="22"/>
         </w:rPr>
-        <w:t xml:space="preserve">Verbatim evidence and a verified-citation registry. </w:t>
-      </w:r>
-      <w:r>
-        <w:rPr>
-          <w:rFonts w:ascii="Arial" w:cs="Arial" w:eastAsia="Arial" w:hAnsi="Arial"/>
-          <w:sz w:val="22"/>
-          <w:szCs w:val="22"/>
-        </w:rPr>
-        <w:t xml:space="preserve">All 940 evidence quotes are tested as exact substrings, so the app can highlight them. Official legal sites were blocked from the build environment, so the 21 legal references are held at instrument level and marked "section not verified".</w:t>
+        <w:t xml:space="preserve">Evidence and citation controls. </w:t>
+      </w:r>
+      <w:r>
+        <w:rPr>
+          <w:rFonts w:ascii="Arial" w:cs="Arial" w:eastAsia="Arial" w:hAnsi="Arial"/>
+          <w:sz w:val="22"/>
+          <w:szCs w:val="22"/>
+        </w:rPr>
+        <w:t xml:space="preserve">All 940 evidence quotes are checked as exact substrings. Citations come only from a registry with a verified flag; official legal sites were unreachable from the build environment, so the 21 legal references stay at instrument level.</w:t>
       </w:r>
     </w:p>
     <w:p>
@@ -838,7 +842,7 @@
         <w:rPr>
           <w:rFonts w:ascii="Arial" w:cs="Arial" w:eastAsia="Arial" w:hAnsi="Arial"/>
         </w:rPr>
-        <w:t xml:space="preserve">How I iterated</w:t>
+        <w:t xml:space="preserve">Iteration</w:t>
       </w:r>
     </w:p>
     <w:p>
@@ -851,12 +855,13 @@
           <w:sz w:val="22"/>
           <w:szCs w:val="22"/>
         </w:rPr>
-        <w:t xml:space="preserve">The first prompt (v1) was piloted on 10 rules and only 1 passed validation: the recommendations already pointed the right way, but reasoning shrank to one-word findings and evidence was missing. A critical review mapped 13 problems to 13 new prompt rules (v2); the re-run passed 10 of 10 with no recommendation changing. In the batch run, 9 of the other 90 assessments failed first-pass validation, all for single-sentence reasoning. Similarity also needed a second version: broad trigger categories caused ties and false matches until I split them into 36 trigger types. A consistency audit then found 29 missing "pending similar submission" flags, 9 explanations that never said why similar rules had different outcomes, and 2 misapplied findings; 38 fixes across 29 assessments cleared them without changing any recommendation. A 15-rule spot check agreed with 12, partly with 1 and disagreed with 2, which I left as override candidates rather than editing findings to fit. Finally, 134 unit tests, 6 end-to-end tests and an accessibility scan found 4 bugs that type checks missed, including PDF upload failing in Chromium.</w:t>
+        <w:t xml:space="preserve">Prompt v1, piloted on 10 rules, passed validation once: the recommendations were already right, but reasoning collapsed to one-word findings and evidence was missing. I mapped 13 defects to 13 new rules (v2); the re-run passed 10 of 10 with no recommendation changing. In the full run, 9 of the remaining 90 failed first-pass validation, all for single-sentence reasoning. Similarity needed a second version: coarse trigger categories produced ties and false matches until I split them into 36 trigger types. A consistency audit then found 29 missing pending-submission flags, 9 explanations that did not say why similar rules diverged, and 2 misapplied findings; 38 edits across 29 assessments cleared them with no recommendation change. A 15-rule spot check agreed on 12, partly on 1 and disagreed on 2, which I left as override candidates rather than tuning findings. Finally, 134 unit tests, 6 end-to-end tests and an axe accessibility scan caught 4 defects that type-checking missed, including PDF upload failing in Chromium.</w:t>
       </w:r>
     </w:p>
     <w:p>
       <w:pPr>
         <w:pStyle w:val="Heading1"/>
+        <w:pageBreakBefore/>
         <w:spacing w:after="80" w:before="160"/>
       </w:pPr>
       <w:r>
@@ -864,19 +869,6 @@
           <w:rFonts w:ascii="Arial" w:cs="Arial" w:eastAsia="Arial" w:hAnsi="Arial"/>
         </w:rPr>
         <w:t xml:space="preserve">3. Limitations and Risks</w:t>
-      </w:r>
-    </w:p>
-    <w:p>
-      <w:pPr>
-        <w:spacing w:after="60" w:line="252"/>
-      </w:pPr>
-      <w:r>
-        <w:rPr>
-          <w:rFonts w:ascii="Arial" w:cs="Arial" w:eastAsia="Arial" w:hAnsi="Arial"/>
-          <w:sz w:val="22"/>
-          <w:szCs w:val="22"/>
-        </w:rPr>
-        <w:t xml:space="preserve">Simrule's limits are deliberate and published on its How it works page, but each matters for a real deployment.</w:t>
       </w:r>
     </w:p>
     <w:p>
@@ -888,7 +880,7 @@
         <w:rPr>
           <w:rFonts w:ascii="Arial" w:cs="Arial" w:eastAsia="Arial" w:hAnsi="Arial"/>
         </w:rPr>
-        <w:t xml:space="preserve">What production needs that the prototype lacks</w:t>
+        <w:t xml:space="preserve">Gaps between prototype and production</w:t>
       </w:r>
     </w:p>
     <w:p>
@@ -908,15 +900,15 @@
           <w:sz w:val="22"/>
           <w:szCs w:val="22"/>
         </w:rPr>
-        <w:t xml:space="preserve">Live, server-side AI. </w:t>
-      </w:r>
-      <w:r>
-        <w:rPr>
-          <w:rFonts w:ascii="Arial" w:cs="Arial" w:eastAsia="Arial" w:hAnsi="Arial"/>
-          <w:sz w:val="22"/>
-          <w:szCs w:val="22"/>
-        </w:rPr>
-        <w:t xml:space="preserve">The 100 assessments were generated once and frozen. New uploads get low-confidence keyword triage unless a visitor runs the optional live assessment with their own API key. Production needs a server-side model with retrieval over a versioned regulatory corpus.</w:t>
+        <w:t xml:space="preserve">Inference. </w:t>
+      </w:r>
+      <w:r>
+        <w:rPr>
+          <w:rFonts w:ascii="Arial" w:cs="Arial" w:eastAsia="Arial" w:hAnsi="Arial"/>
+          <w:sz w:val="22"/>
+          <w:szCs w:val="22"/>
+        </w:rPr>
+        <w:t xml:space="preserve">The 100 assessments are precomputed and frozen. New uploads get keyword triage only, unless a user supplies their own API key for the optional live assessment. Production needs server-side inference with retrieval over a versioned regulatory corpus, with cost and latency monitoring.</w:t>
       </w:r>
     </w:p>
     <w:p>
@@ -936,15 +928,15 @@
           <w:sz w:val="22"/>
           <w:szCs w:val="22"/>
         </w:rPr>
-        <w:t xml:space="preserve">Authentication, roles and secure storage. </w:t>
-      </w:r>
-      <w:r>
-        <w:rPr>
-          <w:rFonts w:ascii="Arial" w:cs="Arial" w:eastAsia="Arial" w:hAnsi="Arial"/>
-          <w:sz w:val="22"/>
-          <w:szCs w:val="22"/>
-        </w:rPr>
-        <w:t xml:space="preserve">Roles are a demonstration switch and data lives in the browser. Confidential filings need access control, encryption and records retention.</w:t>
+        <w:t xml:space="preserve">Security and records. </w:t>
+      </w:r>
+      <w:r>
+        <w:rPr>
+          <w:rFonts w:ascii="Arial" w:cs="Arial" w:eastAsia="Arial" w:hAnsi="Arial"/>
+          <w:sz w:val="22"/>
+          <w:szCs w:val="22"/>
+        </w:rPr>
+        <w:t xml:space="preserve">There is no authentication, roles are a demo switch, and data lives in browser storage. Confidential filings need access control, encryption and a retention policy.</w:t>
       </w:r>
     </w:p>
     <w:p>
@@ -972,7 +964,7 @@
           <w:sz w:val="22"/>
           <w:szCs w:val="22"/>
         </w:rPr>
-        <w:t xml:space="preserve">Filings should arrive from the regulator's systems, not manual upload, and the scoring weights must be back-tested against historical decisions, not only 13 anchor rules I chose.</w:t>
+        <w:t xml:space="preserve">There is no link to the regulator's filing systems, and the scoring weights were checked only against 13 anchor rules, not back-tested on historical decisions.</w:t>
       </w:r>
     </w:p>
     <w:p>
@@ -992,15 +984,15 @@
           <w:sz w:val="22"/>
           <w:szCs w:val="22"/>
         </w:rPr>
-        <w:t xml:space="preserve">Service and monitoring. </w:t>
-      </w:r>
-      <w:r>
-        <w:rPr>
-          <w:rFonts w:ascii="Arial" w:cs="Arial" w:eastAsia="Arial" w:hAnsi="Arial"/>
-          <w:sz w:val="22"/>
-          <w:szCs w:val="22"/>
-        </w:rPr>
-        <w:t xml:space="preserve">French-language service, accessibility testing with real reviewers, and ongoing monitoring of model quality, cost and latency.</w:t>
+        <w:t xml:space="preserve">Coverage. </w:t>
+      </w:r>
+      <w:r>
+        <w:rPr>
+          <w:rFonts w:ascii="Arial" w:cs="Arial" w:eastAsia="Arial" w:hAnsi="Arial"/>
+          <w:sz w:val="22"/>
+          <w:szCs w:val="22"/>
+        </w:rPr>
+        <w:t xml:space="preserve">English only, no accessibility testing with real reviewers, and no ongoing monitoring of model quality.</w:t>
       </w:r>
     </w:p>
     <w:p>
@@ -1032,15 +1024,15 @@
           <w:sz w:val="22"/>
           <w:szCs w:val="22"/>
         </w:rPr>
-        <w:t xml:space="preserve">Hallucinated or stale citations. </w:t>
-      </w:r>
-      <w:r>
-        <w:rPr>
-          <w:rFonts w:ascii="Arial" w:cs="Arial" w:eastAsia="Arial" w:hAnsi="Arial"/>
-          <w:sz w:val="22"/>
-          <w:szCs w:val="22"/>
-        </w:rPr>
-        <w:t xml:space="preserve">Citations are restricted to an id-based registry with a verified flag, but none of the 21 legal references has yet been checked against the official text (listed in VERIFY.md).</w:t>
+        <w:t xml:space="preserve">Citation errors. </w:t>
+      </w:r>
+      <w:r>
+        <w:rPr>
+          <w:rFonts w:ascii="Arial" w:cs="Arial" w:eastAsia="Arial" w:hAnsi="Arial"/>
+          <w:sz w:val="22"/>
+          <w:szCs w:val="22"/>
+        </w:rPr>
+        <w:t xml:space="preserve">Models can invent or misstate references. Citations are restricted to ids in a registry with a verified flag; the 21 legal references still need checking (VERIFY.md).</w:t>
       </w:r>
     </w:p>
     <w:p>
@@ -1060,15 +1052,15 @@
           <w:sz w:val="22"/>
           <w:szCs w:val="22"/>
         </w:rPr>
-        <w:t xml:space="preserve">Automation bias and rubber-stamping. </w:t>
-      </w:r>
-      <w:r>
-        <w:rPr>
-          <w:rFonts w:ascii="Arial" w:cs="Arial" w:eastAsia="Arial" w:hAnsi="Arial"/>
-          <w:sz w:val="22"/>
-          <w:szCs w:val="22"/>
-        </w:rPr>
-        <w:t xml:space="preserve">A reviewer who accepts everything adds nothing. Simrule requires a decision on all 15 findings and shows the acceptance rate, treating very high agreement as a warning sign.</w:t>
+        <w:t xml:space="preserve">Automation bias. </w:t>
+      </w:r>
+      <w:r>
+        <w:rPr>
+          <w:rFonts w:ascii="Arial" w:cs="Arial" w:eastAsia="Arial" w:hAnsi="Arial"/>
+          <w:sz w:val="22"/>
+          <w:szCs w:val="22"/>
+        </w:rPr>
+        <w:t xml:space="preserve">Reviewers may accept findings without reading them. A decision is blocked until all 15 findings are validated, and the dashboard reports the acceptance rate and treats very high agreement as a warning.</w:t>
       </w:r>
     </w:p>
     <w:p>
@@ -1088,15 +1080,15 @@
           <w:sz w:val="22"/>
           <w:szCs w:val="22"/>
         </w:rPr>
-        <w:t xml:space="preserve">Proxy discrimination the model misses. </w:t>
-      </w:r>
-      <w:r>
-        <w:rPr>
-          <w:rFonts w:ascii="Arial" w:cs="Arial" w:eastAsia="Arial" w:hAnsi="Arial"/>
-          <w:sz w:val="22"/>
-          <w:szCs w:val="22"/>
-        </w:rPr>
-        <w:t xml:space="preserve">Language, postal code or benefit status can track protected grounds. Keyword triage catches some wording; subtle proxies need reviewers and disparate-impact testing.</w:t>
+        <w:t xml:space="preserve">Missed proxy discrimination. </w:t>
+      </w:r>
+      <w:r>
+        <w:rPr>
+          <w:rFonts w:ascii="Arial" w:cs="Arial" w:eastAsia="Arial" w:hAnsi="Arial"/>
+          <w:sz w:val="22"/>
+          <w:szCs w:val="22"/>
+        </w:rPr>
+        <w:t xml:space="preserve">Language, postal code or benefit status can track protected grounds. Keyword triage catches explicit wording only; disparate-impact testing and reviewer judgment are still required.</w:t>
       </w:r>
     </w:p>
     <w:p>
@@ -1124,7 +1116,7 @@
           <w:sz w:val="22"/>
           <w:szCs w:val="22"/>
         </w:rPr>
-        <w:t xml:space="preserve">Insurers could learn the issue codes and draft rules that avoid flags while keeping the same effect, so reviewers must judge substance and the taxonomy must evolve.</w:t>
+        <w:t xml:space="preserve">Insurers could draft rules around the issue codes while keeping the same effect. Reviewers must judge substance, and the taxonomy needs maintenance.</w:t>
       </w:r>
     </w:p>
     <w:p>
@@ -1144,15 +1136,15 @@
           <w:sz w:val="22"/>
           <w:szCs w:val="22"/>
         </w:rPr>
-        <w:t xml:space="preserve">Model and regulation drift; over-reliance on a precomputed set. </w:t>
-      </w:r>
-      <w:r>
-        <w:rPr>
-          <w:rFonts w:ascii="Arial" w:cs="Arial" w:eastAsia="Arial" w:hAnsi="Arial"/>
-          <w:sz w:val="22"/>
-          <w:szCs w:val="22"/>
-        </w:rPr>
-        <w:t xml:space="preserve">Each assessment is stamped with prompt and framework versions so it can be re-run when guidance changes, and the consistency monitor tracks overrides by issue code to reveal drift.</w:t>
+        <w:t xml:space="preserve">Correlated errors in evaluation. </w:t>
+      </w:r>
+      <w:r>
+        <w:rPr>
+          <w:rFonts w:ascii="Arial" w:cs="Arial" w:eastAsia="Arial" w:hAnsi="Arial"/>
+          <w:sz w:val="22"/>
+          <w:szCs w:val="22"/>
+        </w:rPr>
+        <w:t xml:space="preserve">The same AI drafted the assessments and ran the consistency audit, so its mistakes can be correlated. The 15-rule spot check is small and was done by the builder, not an independent reviewer.</w:t>
       </w:r>
     </w:p>
     <w:p>
@@ -1172,6 +1164,62 @@
           <w:sz w:val="22"/>
           <w:szCs w:val="22"/>
         </w:rPr>
+        <w:t xml:space="preserve">Shallow text matching. </w:t>
+      </w:r>
+      <w:r>
+        <w:rPr>
+          <w:rFonts w:ascii="Arial" w:cs="Arial" w:eastAsia="Arial" w:hAnsi="Arial"/>
+          <w:sz w:val="22"/>
+          <w:szCs w:val="22"/>
+        </w:rPr>
+        <w:t xml:space="preserve">TF-IDF similarity misses rules that mean the same thing in different words, and keyword triage can misfire: in testing, "race" in "organized race" was flagged as a protected ground until the pattern was fixed.</w:t>
+      </w:r>
+    </w:p>
+    <w:p>
+      <w:pPr>
+        <w:pStyle w:val="ListParagraph"/>
+        <w:numPr>
+          <w:ilvl w:val="0"/>
+          <w:numId w:val="1"/>
+        </w:numPr>
+        <w:spacing w:after="50" w:line="252"/>
+      </w:pPr>
+      <w:r>
+        <w:rPr>
+          <w:rFonts w:ascii="Arial" w:cs="Arial" w:eastAsia="Arial" w:hAnsi="Arial"/>
+          <w:b/>
+          <w:bCs/>
+          <w:sz w:val="22"/>
+          <w:szCs w:val="22"/>
+        </w:rPr>
+        <w:t xml:space="preserve">Drift. </w:t>
+      </w:r>
+      <w:r>
+        <w:rPr>
+          <w:rFonts w:ascii="Arial" w:cs="Arial" w:eastAsia="Arial" w:hAnsi="Arial"/>
+          <w:sz w:val="22"/>
+          <w:szCs w:val="22"/>
+        </w:rPr>
+        <w:t xml:space="preserve">Models, guidance and markets change. Each assessment records its prompt and framework versions so it can be re-run, and the consistency monitor tracks overrides by issue code.</w:t>
+      </w:r>
+    </w:p>
+    <w:p>
+      <w:pPr>
+        <w:pStyle w:val="ListParagraph"/>
+        <w:numPr>
+          <w:ilvl w:val="0"/>
+          <w:numId w:val="1"/>
+        </w:numPr>
+        <w:spacing w:after="50" w:line="252"/>
+      </w:pPr>
+      <w:r>
+        <w:rPr>
+          <w:rFonts w:ascii="Arial" w:cs="Arial" w:eastAsia="Arial" w:hAnsi="Arial"/>
+          <w:b/>
+          <w:bCs/>
+          <w:sz w:val="22"/>
+          <w:szCs w:val="22"/>
+        </w:rPr>
         <w:t xml:space="preserve">Privacy. </w:t>
       </w:r>
       <w:r>
@@ -1180,7 +1228,7 @@
           <w:sz w:val="22"/>
           <w:szCs w:val="22"/>
         </w:rPr>
-        <w:t xml:space="preserve">Filings can contain personal information. The optional live assessment sends text to an external API and must stay off for confidential data.</w:t>
+        <w:t xml:space="preserve">Filings may contain personal information. The optional live assessment sends text to an external API and must stay off for confidential material.</w:t>
       </w:r>
     </w:p>
     <w:p>
@@ -1192,7 +1240,7 @@
         <w:rPr>
           <w:rFonts w:ascii="Arial" w:cs="Arial" w:eastAsia="Arial" w:hAnsi="Arial"/>
         </w:rPr>
-        <w:t xml:space="preserve">How human oversight is built in</w:t>
+        <w:t xml:space="preserve">Human oversight</w:t>
       </w:r>
     </w:p>
     <w:p>
@@ -1205,12 +1253,13 @@
           <w:sz w:val="22"/>
           <w:szCs w:val="22"/>
         </w:rPr>
-        <w:t xml:space="preserve">People act at every step that changes an outcome. The reviewer confirms each extraction before triage, then accepts or overrides all 15 findings, with a reason code and note for every override; the score recomputes and the change is marked as human. Senior sign-off is required when the decision differs from the AI, a Level 1 finding is overridden, confidence is low, a Level 1 concern is flagged or the case is escalated. The rationale becomes final only after the reviewer confirms "I have reviewed this rationale and take ownership of it". Every action is written to an audit trail (time, person, role, before and after, reason), and the consistency monitor shows where people and the AI diverge.</w:t>
+        <w:t xml:space="preserve">Every step that can change an outcome needs a person. The reviewer confirms each extraction, then accepts or overrides all 15 findings, with a reason code and note for each override. Senior sign-off is required when the decision differs from the AI, a Level 1 finding is overridden, confidence is low, a Level 1 concern is raised or the case is escalated. The rationale is final only after the reviewer confirms "I have reviewed this rationale and take ownership of it". Every action is logged with time, actor, role, before and after values, and reason.</w:t>
       </w:r>
     </w:p>
     <w:p>
       <w:pPr>
         <w:pStyle w:val="Heading1"/>
+        <w:pageBreakBefore/>
         <w:spacing w:after="80" w:before="160"/>
       </w:pPr>
       <w:r>
@@ -1230,7 +1279,7 @@
           <w:sz w:val="22"/>
           <w:szCs w:val="22"/>
         </w:rPr>
-        <w:t xml:space="preserve">I came to this project from quantitative finance, where I model limit order book data and judge a model by its out-of-sample error. </w:t>
+        <w:t xml:space="preserve">My background is quantitative finance: I model limit order book data and judge models by out-of-sample error. </w:t>
       </w:r>
       <w:r>
         <w:rPr>
@@ -1246,7 +1295,7 @@
           <w:sz w:val="22"/>
           <w:szCs w:val="22"/>
         </w:rPr>
-        <w:t xml:space="preserve">The pilot showed this directly. The first prompt already pointed in the right direction on all 10 pilot rules, yet 9 of the 10 assessments failed validation because the reasoning and evidence were too thin to show a reviewer. </w:t>
+        <w:t xml:space="preserve">The pilot showed this. The first prompt already reached the right recommendations on all 10 pilot rules, yet 9 of the 10 assessments failed validation because the reasoning and evidence were too thin to show a reviewer. </w:t>
       </w:r>
       <w:r>
         <w:rPr>
@@ -1262,7 +1311,7 @@
           <w:sz w:val="22"/>
           <w:szCs w:val="22"/>
         </w:rPr>
-        <w:t xml:space="preserve">Separating the findings from a deterministic scoring rule is what made the system auditable: the same findings always give the same recommendation, and a reviewer can point to the exact finding they disagree with.</w:t>
+        <w:t xml:space="preserve">Separating findings from a deterministic scoring rule is what made the system auditable: the same findings always give the same recommendation, and a reviewer can point to the exact finding they dispute.</w:t>
       </w:r>
     </w:p>
     <w:p>
@@ -1275,7 +1324,7 @@
           <w:sz w:val="22"/>
           <w:szCs w:val="22"/>
         </w:rPr>
-        <w:t xml:space="preserve">I am a CEMS MIM student, currently on exchange in London. </w:t>
+        <w:t xml:space="preserve">I am a CEMS MIM student, currently on exchange in London. The project used the same toolkit a quant team relies on: a specified schema, a validation harness, thresholds calibrated against anchor cases, and an audit of outputs for consistency. </w:t>
       </w:r>
       <w:r>
         <w:rPr>
@@ -1307,7 +1356,7 @@
           <w:sz w:val="22"/>
           <w:szCs w:val="22"/>
         </w:rPr>
-        <w:t xml:space="preserve">I also want to design the audit trail first rather than last, since the accuracy and integrity is the most crucial element of all, and it is the feature that makes everything else trustworthy.</w:t>
+        <w:t xml:space="preserve">I also want to design the audit trail first rather than last, because its accuracy and integrity matter most: it is the feature that makes everything else trustworthy.</w:t>
       </w:r>
     </w:p>
     <w:p>
@@ -1320,15 +1369,15 @@
           <w:sz w:val="22"/>
           <w:szCs w:val="22"/>
         </w:rPr>
-        <w:t xml:space="preserve">What surprised me most was how often the checks I trusted were too weak to hold AI reach at bay. </w:t>
-      </w:r>
-      <w:r>
-        <w:rPr>
-          <w:rFonts w:ascii="Arial" w:cs="Arial" w:eastAsia="Arial" w:hAnsi="Arial"/>
-          <w:sz w:val="22"/>
-          <w:szCs w:val="22"/>
-        </w:rPr>
-        <w:t xml:space="preserve">The automated consistency check passed 15 of 16 similar pairs with different outcomes, but reading them showed that 8 explanations described the similarity without ever saying why the outcomes differed. The end-to-end test, not the unit tests, found that PDF upload failed in Chromium because a library called a JavaScript method the browser does not yet support. </w:t>
+        <w:t xml:space="preserve">What surprised me most was how often the checks I trusted were too weak to keep the AI in line. </w:t>
+      </w:r>
+      <w:r>
+        <w:rPr>
+          <w:rFonts w:ascii="Arial" w:cs="Arial" w:eastAsia="Arial" w:hAnsi="Arial"/>
+          <w:sz w:val="22"/>
+          <w:szCs w:val="22"/>
+        </w:rPr>
+        <w:t xml:space="preserve">An automated consistency check passed 15 of 16 similar pairs with different outcomes, yet reading them showed that 8 explanations described the similarity without saying why the outcomes differed. The end-to-end test, not the unit tests, found that PDF upload failed in Chromium because a library called a JavaScript method the browser does not yet support. </w:t>
       </w:r>
       <w:r>
         <w:rPr>
@@ -1344,15 +1393,15 @@
           <w:sz w:val="22"/>
           <w:szCs w:val="22"/>
         </w:rPr>
-        <w:t xml:space="preserve">The actuarial severity rule had to be clarified at batch 7, when read literally it would have sent every novel administrative rule to an information request. </w:t>
-      </w:r>
-      <w:r>
-        <w:rPr>
-          <w:rFonts w:ascii="Arial" w:cs="Arial" w:eastAsia="Arial" w:hAnsi="Arial"/>
-          <w:sz w:val="22"/>
-          <w:szCs w:val="22"/>
-        </w:rPr>
-        <w:t xml:space="preserve">The lesson I take away is that trust in AI is earned by making disagreement easy: a reviewer must read the output line by line, or at least block by block, see the evidence, be able to override it with a reason, while knowing that someone else will check.</w:t>
+        <w:t xml:space="preserve">The actuarial-severity rule had to be clarified at batch 7 because, read literally, it would have sent every new administrative rule to an information request. The consistency audit ended with 38 edits across 29 assessments and no change to any recommendation: the problems were in the explanations, not the scores. </w:t>
+      </w:r>
+      <w:r>
+        <w:rPr>
+          <w:rFonts w:ascii="Arial" w:cs="Arial" w:eastAsia="Arial" w:hAnsi="Arial"/>
+          <w:sz w:val="22"/>
+          <w:szCs w:val="22"/>
+        </w:rPr>
+        <w:t xml:space="preserve">The lesson I take away is that trust in AI is earned by making disagreement easy: a reviewer must read the output line by line, or at least block by block, see the evidence, override it with a reason, and know that someone else will check.</w:t>
       </w:r>
     </w:p>
     <w:p>
@@ -1434,7 +1483,7 @@
           <w:sz w:val="19"/>
           <w:szCs w:val="19"/>
         </w:rPr>
-        <w:t xml:space="preserve">Simrule solution architecture. Numbered steps follow one submission through four swimlanes; H marks human touchpoints and A marks accountability controls. Full size: deliverables/architecture/simrule-architecture.pdf and the How it works page of the live app.</w:t>
+        <w:t xml:space="preserve">Solution architecture. Numbered steps follow one submission through four swimlanes; H marks human touchpoints and A marks accountability controls. Full size: deliverables/architecture/simrule-architecture.pdf and the How it works page of the live app.</w:t>
       </w:r>
     </w:p>
     <w:p>
@@ -1459,7 +1508,7 @@
           <w:sz w:val="22"/>
           <w:szCs w:val="22"/>
         </w:rPr>
-        <w:t xml:space="preserve">Claude Code (Anthropic) was the engineering and analysis partner for this assignment. Working from my written brief, it wrote the application code and tests, generated the 100 structured assessments with a versioned prompt (the deterministic scoring code, not the model, produces each recommendation), produced the architecture diagram and screen-recording script, and drafted this report from the project logs (PROGRESS.md and prompt-log.md). Every number in the report comes from those logs. Legal references were not verified against official sources and are listed for checking in VERIFY.md. </w:t>
+        <w:t xml:space="preserve">Claude Code (Anthropic) was the engineering and analysis partner. Working from my written brief, it wrote the application code and tests, generated the 100 structured assessments under a versioned prompt (recommendations come from the deterministic scoring code, not the model), produced the architecture diagram and screen-recording script, and drafted this report from the project logs (PROGRESS.md and prompt-log.md). All figures come from those logs. Legal references were not verified against official sources; they are listed in VERIFY.md. </w:t>
       </w:r>
       <w:r>
         <w:rPr>

</xml_diff>